<commit_message>
added AI foremost reports, updated forensic file tracking
</commit_message>
<xml_diff>
--- a/Weekly Logs/Matt/Matt Baker - Week 11 Individual Logbook.docx
+++ b/Weekly Logs/Matt/Matt Baker - Week 11 Individual Logbook.docx
@@ -3421,10 +3421,16 @@
       <w:r>
         <w:t>12:15PM</w:t>
       </w:r>
-    </w:p>
-    <w:p>
-      <w:r>
-        <w:t xml:space="preserve">Officially created reports using </w:t>
+      <w:r>
+        <w:t xml:space="preserve"> – 3:00PM</w:t>
+      </w:r>
+    </w:p>
+    <w:p>
+      <w:r>
+        <w:t>Set out to o</w:t>
+      </w:r>
+      <w:r>
+        <w:t xml:space="preserve">fficially create reports using </w:t>
       </w:r>
       <w:r>
         <w:rPr>
@@ -3437,12 +3443,552 @@
         <w:t xml:space="preserve"> for our 3 .dd files.</w:t>
       </w:r>
     </w:p>
+    <w:p>
+      <w:r>
+        <w:t>I had to update my Ninemost script to calculate token count like my SilentCartographerV1 script. Dave had done this already, but h</w:t>
+      </w:r>
+      <w:r>
+        <w:t xml:space="preserve">e had done this with AI, so I chose to update </w:t>
+      </w:r>
+      <w:r>
+        <w:t>N</w:t>
+      </w:r>
+      <w:r>
+        <w:t>inemost myself. I also homogenised the two script’s formatting.</w:t>
+      </w:r>
+    </w:p>
+    <w:p>
+      <w:r>
+        <w:t xml:space="preserve">Took awhile fixing </w:t>
+      </w:r>
+      <w:r>
+        <w:t xml:space="preserve">syntax </w:t>
+      </w:r>
+      <w:r>
+        <w:t>issue</w:t>
+      </w:r>
+      <w:r>
+        <w:t>s like</w:t>
+      </w:r>
+      <w:r>
+        <w:t xml:space="preserve"> where I went -verbose instead of </w:t>
+      </w:r>
+      <w:r>
+        <w:t>–</w:t>
+      </w:r>
+      <w:r>
+        <w:t>verbose</w:t>
+      </w:r>
+      <w:r>
+        <w:t>, and “</w:t>
+      </w:r>
+      <w:r>
+        <w:t>T</w:t>
+      </w:r>
+      <w:r>
+        <w:t>ext” instead of “</w:t>
+      </w:r>
+      <w:r>
+        <w:t>t</w:t>
+      </w:r>
+      <w:r>
+        <w:t>ext”.</w:t>
+      </w:r>
+    </w:p>
+    <w:p>
+      <w:r>
+        <w:t>Then, I could conduct the report generation</w:t>
+      </w:r>
+      <w:r>
+        <w:t>, documentation, monitoring, and migrating files to the git</w:t>
+      </w:r>
+      <w:r>
+        <w:t>.</w:t>
+      </w:r>
+    </w:p>
+    <w:p>
+      <w:pPr>
+        <w:rPr>
+          <w:b/>
+          <w:bCs/>
+        </w:rPr>
+      </w:pPr>
+      <w:r>
+        <w:rPr>
+          <w:b/>
+          <w:bCs/>
+        </w:rPr>
+        <w:t>Eight.dd</w:t>
+      </w:r>
+    </w:p>
+    <w:p>
+      <w:r>
+        <w:t>For documentation purposes</w:t>
+      </w:r>
+      <w:r>
+        <w:t>, nvtop (1), active NinemostV1.py (2) and htop (3)</w:t>
+      </w:r>
+      <w:r>
+        <w:t>.</w:t>
+      </w:r>
+    </w:p>
+    <w:p>
+      <w:pPr>
+        <w:rPr>
+          <w:b/>
+          <w:bCs/>
+        </w:rPr>
+      </w:pPr>
+      <w:r>
+        <w:rPr>
+          <w:b/>
+          <w:bCs/>
+        </w:rPr>
+        <w:drawing>
+          <wp:inline distT="0" distB="0" distL="0" distR="0" wp14:anchorId="6988DEBE" wp14:editId="4F329460">
+            <wp:extent cx="5729605" cy="2072005"/>
+            <wp:effectExtent l="0" t="0" r="4445" b="4445"/>
+            <wp:docPr id="1519499156" name="Picture 1"/>
+            <wp:cNvGraphicFramePr>
+              <a:graphicFrameLocks xmlns:a="http://schemas.openxmlformats.org/drawingml/2006/main" noChangeAspect="1"/>
+            </wp:cNvGraphicFramePr>
+            <a:graphic xmlns:a="http://schemas.openxmlformats.org/drawingml/2006/main">
+              <a:graphicData uri="http://schemas.openxmlformats.org/drawingml/2006/picture">
+                <pic:pic xmlns:pic="http://schemas.openxmlformats.org/drawingml/2006/picture">
+                  <pic:nvPicPr>
+                    <pic:cNvPr id="1519499156" name=""/>
+                    <pic:cNvPicPr/>
+                  </pic:nvPicPr>
+                  <pic:blipFill>
+                    <a:blip r:embed="rId19"/>
+                    <a:stretch>
+                      <a:fillRect/>
+                    </a:stretch>
+                  </pic:blipFill>
+                  <pic:spPr>
+                    <a:xfrm>
+                      <a:off x="0" y="0"/>
+                      <a:ext cx="5729605" cy="2072005"/>
+                    </a:xfrm>
+                    <a:prstGeom prst="rect">
+                      <a:avLst/>
+                    </a:prstGeom>
+                  </pic:spPr>
+                </pic:pic>
+              </a:graphicData>
+            </a:graphic>
+          </wp:inline>
+        </w:drawing>
+      </w:r>
+    </w:p>
+    <w:p>
+      <w:r>
+        <w:t>Took 68.22 seconds, cost 3856 tokens</w:t>
+      </w:r>
+      <w:r>
+        <w:t>.</w:t>
+      </w:r>
+    </w:p>
+    <w:p>
+      <w:pPr>
+        <w:rPr>
+          <w:b/>
+          <w:bCs/>
+        </w:rPr>
+      </w:pPr>
+      <w:r>
+        <w:rPr>
+          <w:b/>
+          <w:bCs/>
+        </w:rPr>
+        <w:drawing>
+          <wp:inline distT="0" distB="0" distL="0" distR="0" wp14:anchorId="166A793A" wp14:editId="33B357C2">
+            <wp:extent cx="2863808" cy="2647666"/>
+            <wp:effectExtent l="0" t="0" r="0" b="635"/>
+            <wp:docPr id="1391154394" name="Picture 1"/>
+            <wp:cNvGraphicFramePr>
+              <a:graphicFrameLocks xmlns:a="http://schemas.openxmlformats.org/drawingml/2006/main" noChangeAspect="1"/>
+            </wp:cNvGraphicFramePr>
+            <a:graphic xmlns:a="http://schemas.openxmlformats.org/drawingml/2006/main">
+              <a:graphicData uri="http://schemas.openxmlformats.org/drawingml/2006/picture">
+                <pic:pic xmlns:pic="http://schemas.openxmlformats.org/drawingml/2006/picture">
+                  <pic:nvPicPr>
+                    <pic:cNvPr id="1391154394" name=""/>
+                    <pic:cNvPicPr/>
+                  </pic:nvPicPr>
+                  <pic:blipFill>
+                    <a:blip r:embed="rId20"/>
+                    <a:stretch>
+                      <a:fillRect/>
+                    </a:stretch>
+                  </pic:blipFill>
+                  <pic:spPr>
+                    <a:xfrm>
+                      <a:off x="0" y="0"/>
+                      <a:ext cx="2871142" cy="2654446"/>
+                    </a:xfrm>
+                    <a:prstGeom prst="rect">
+                      <a:avLst/>
+                    </a:prstGeom>
+                  </pic:spPr>
+                </pic:pic>
+              </a:graphicData>
+            </a:graphic>
+          </wp:inline>
+        </w:drawing>
+      </w:r>
+    </w:p>
+    <w:p>
+      <w:pPr>
+        <w:rPr>
+          <w:b/>
+          <w:bCs/>
+        </w:rPr>
+      </w:pPr>
+    </w:p>
+    <w:p>
+      <w:pPr>
+        <w:rPr>
+          <w:b/>
+          <w:bCs/>
+        </w:rPr>
+      </w:pPr>
+      <w:r>
+        <w:rPr>
+          <w:b/>
+          <w:bCs/>
+        </w:rPr>
+        <w:lastRenderedPageBreak/>
+        <w:t>Three.dd</w:t>
+      </w:r>
+    </w:p>
+    <w:p>
+      <w:r>
+        <w:t>For documentation purposes</w:t>
+      </w:r>
+      <w:r>
+        <w:t>, nvtop (1), active NinemostV1.py (2) and htop (3).</w:t>
+      </w:r>
+    </w:p>
+    <w:p>
+      <w:pPr>
+        <w:rPr>
+          <w:b/>
+          <w:bCs/>
+        </w:rPr>
+      </w:pPr>
+      <w:r>
+        <w:rPr>
+          <w:b/>
+          <w:bCs/>
+        </w:rPr>
+        <w:drawing>
+          <wp:inline distT="0" distB="0" distL="0" distR="0" wp14:anchorId="52FAB4B0" wp14:editId="69AC3FC3">
+            <wp:extent cx="5729605" cy="2066290"/>
+            <wp:effectExtent l="0" t="0" r="4445" b="0"/>
+            <wp:docPr id="1236893012" name="Picture 1"/>
+            <wp:cNvGraphicFramePr>
+              <a:graphicFrameLocks xmlns:a="http://schemas.openxmlformats.org/drawingml/2006/main" noChangeAspect="1"/>
+            </wp:cNvGraphicFramePr>
+            <a:graphic xmlns:a="http://schemas.openxmlformats.org/drawingml/2006/main">
+              <a:graphicData uri="http://schemas.openxmlformats.org/drawingml/2006/picture">
+                <pic:pic xmlns:pic="http://schemas.openxmlformats.org/drawingml/2006/picture">
+                  <pic:nvPicPr>
+                    <pic:cNvPr id="1236893012" name=""/>
+                    <pic:cNvPicPr/>
+                  </pic:nvPicPr>
+                  <pic:blipFill>
+                    <a:blip r:embed="rId21"/>
+                    <a:stretch>
+                      <a:fillRect/>
+                    </a:stretch>
+                  </pic:blipFill>
+                  <pic:spPr>
+                    <a:xfrm>
+                      <a:off x="0" y="0"/>
+                      <a:ext cx="5729605" cy="2066290"/>
+                    </a:xfrm>
+                    <a:prstGeom prst="rect">
+                      <a:avLst/>
+                    </a:prstGeom>
+                  </pic:spPr>
+                </pic:pic>
+              </a:graphicData>
+            </a:graphic>
+          </wp:inline>
+        </w:drawing>
+      </w:r>
+    </w:p>
+    <w:p>
+      <w:r>
+        <w:t>Took 6</w:t>
+      </w:r>
+      <w:r>
+        <w:t>4</w:t>
+      </w:r>
+      <w:r>
+        <w:t>.</w:t>
+      </w:r>
+      <w:r>
+        <w:t>63</w:t>
+      </w:r>
+      <w:r>
+        <w:t xml:space="preserve"> seconds, cost </w:t>
+      </w:r>
+      <w:r>
+        <w:t>2669</w:t>
+      </w:r>
+      <w:r>
+        <w:t xml:space="preserve"> tokens</w:t>
+      </w:r>
+      <w:r>
+        <w:t>.</w:t>
+      </w:r>
+    </w:p>
+    <w:p>
+      <w:pPr>
+        <w:rPr>
+          <w:b/>
+          <w:bCs/>
+        </w:rPr>
+      </w:pPr>
+      <w:r>
+        <w:rPr>
+          <w:b/>
+          <w:bCs/>
+        </w:rPr>
+        <w:drawing>
+          <wp:inline distT="0" distB="0" distL="0" distR="0" wp14:anchorId="7EAE7A6E" wp14:editId="62520558">
+            <wp:extent cx="2866030" cy="2094492"/>
+            <wp:effectExtent l="0" t="0" r="0" b="1270"/>
+            <wp:docPr id="1528797725" name="Picture 1"/>
+            <wp:cNvGraphicFramePr>
+              <a:graphicFrameLocks xmlns:a="http://schemas.openxmlformats.org/drawingml/2006/main" noChangeAspect="1"/>
+            </wp:cNvGraphicFramePr>
+            <a:graphic xmlns:a="http://schemas.openxmlformats.org/drawingml/2006/main">
+              <a:graphicData uri="http://schemas.openxmlformats.org/drawingml/2006/picture">
+                <pic:pic xmlns:pic="http://schemas.openxmlformats.org/drawingml/2006/picture">
+                  <pic:nvPicPr>
+                    <pic:cNvPr id="1528797725" name=""/>
+                    <pic:cNvPicPr/>
+                  </pic:nvPicPr>
+                  <pic:blipFill>
+                    <a:blip r:embed="rId22"/>
+                    <a:stretch>
+                      <a:fillRect/>
+                    </a:stretch>
+                  </pic:blipFill>
+                  <pic:spPr>
+                    <a:xfrm>
+                      <a:off x="0" y="0"/>
+                      <a:ext cx="2874504" cy="2100685"/>
+                    </a:xfrm>
+                    <a:prstGeom prst="rect">
+                      <a:avLst/>
+                    </a:prstGeom>
+                  </pic:spPr>
+                </pic:pic>
+              </a:graphicData>
+            </a:graphic>
+          </wp:inline>
+        </w:drawing>
+      </w:r>
+    </w:p>
+    <w:p>
+      <w:pPr>
+        <w:rPr>
+          <w:b/>
+          <w:bCs/>
+        </w:rPr>
+      </w:pPr>
+    </w:p>
+    <w:p>
+      <w:pPr>
+        <w:rPr>
+          <w:b/>
+          <w:bCs/>
+        </w:rPr>
+      </w:pPr>
+    </w:p>
+    <w:p>
+      <w:pPr>
+        <w:rPr>
+          <w:b/>
+          <w:bCs/>
+        </w:rPr>
+      </w:pPr>
+    </w:p>
+    <w:p>
+      <w:pPr>
+        <w:rPr>
+          <w:b/>
+          <w:bCs/>
+        </w:rPr>
+      </w:pPr>
+    </w:p>
+    <w:p>
+      <w:pPr>
+        <w:rPr>
+          <w:b/>
+          <w:bCs/>
+        </w:rPr>
+      </w:pPr>
+    </w:p>
+    <w:p>
+      <w:pPr>
+        <w:rPr>
+          <w:b/>
+          <w:bCs/>
+        </w:rPr>
+      </w:pPr>
+    </w:p>
+    <w:p>
+      <w:pPr>
+        <w:rPr>
+          <w:b/>
+          <w:bCs/>
+        </w:rPr>
+      </w:pPr>
+    </w:p>
+    <w:p>
+      <w:pPr>
+        <w:rPr>
+          <w:b/>
+          <w:bCs/>
+        </w:rPr>
+      </w:pPr>
+    </w:p>
+    <w:p>
+      <w:pPr>
+        <w:rPr>
+          <w:b/>
+          <w:bCs/>
+        </w:rPr>
+      </w:pPr>
+    </w:p>
+    <w:p>
+      <w:pPr>
+        <w:rPr>
+          <w:b/>
+          <w:bCs/>
+        </w:rPr>
+      </w:pPr>
+    </w:p>
+    <w:p>
+      <w:pPr>
+        <w:rPr>
+          <w:b/>
+          <w:bCs/>
+        </w:rPr>
+      </w:pPr>
+    </w:p>
+    <w:p>
+      <w:pPr>
+        <w:rPr>
+          <w:b/>
+          <w:bCs/>
+        </w:rPr>
+      </w:pPr>
+    </w:p>
+    <w:p>
+      <w:pPr>
+        <w:rPr>
+          <w:b/>
+          <w:bCs/>
+        </w:rPr>
+      </w:pPr>
+      <w:r>
+        <w:rPr>
+          <w:b/>
+          <w:bCs/>
+        </w:rPr>
+        <w:lastRenderedPageBreak/>
+        <w:t>NINE.dd</w:t>
+      </w:r>
+    </w:p>
+    <w:p>
+      <w:r>
+        <w:t>For documentation purposes</w:t>
+      </w:r>
+      <w:r>
+        <w:t>, nvtop (1), active NinemostV1.py (2) and htop (3).</w:t>
+      </w:r>
+    </w:p>
+    <w:p>
+      <w:pPr>
+        <w:rPr>
+          <w:b/>
+          <w:bCs/>
+        </w:rPr>
+      </w:pPr>
+      <w:r>
+        <w:rPr>
+          <w:b/>
+          <w:bCs/>
+        </w:rPr>
+        <w:drawing>
+          <wp:inline distT="0" distB="0" distL="0" distR="0" wp14:anchorId="76441FAF" wp14:editId="3DDBE062">
+            <wp:extent cx="6163320" cy="2228850"/>
+            <wp:effectExtent l="0" t="0" r="8890" b="0"/>
+            <wp:docPr id="2054512616" name="Picture 1"/>
+            <wp:cNvGraphicFramePr>
+              <a:graphicFrameLocks xmlns:a="http://schemas.openxmlformats.org/drawingml/2006/main" noChangeAspect="1"/>
+            </wp:cNvGraphicFramePr>
+            <a:graphic xmlns:a="http://schemas.openxmlformats.org/drawingml/2006/main">
+              <a:graphicData uri="http://schemas.openxmlformats.org/drawingml/2006/picture">
+                <pic:pic xmlns:pic="http://schemas.openxmlformats.org/drawingml/2006/picture">
+                  <pic:nvPicPr>
+                    <pic:cNvPr id="2054512616" name=""/>
+                    <pic:cNvPicPr/>
+                  </pic:nvPicPr>
+                  <pic:blipFill>
+                    <a:blip r:embed="rId23"/>
+                    <a:stretch>
+                      <a:fillRect/>
+                    </a:stretch>
+                  </pic:blipFill>
+                  <pic:spPr>
+                    <a:xfrm>
+                      <a:off x="0" y="0"/>
+                      <a:ext cx="6165864" cy="2229770"/>
+                    </a:xfrm>
+                    <a:prstGeom prst="rect">
+                      <a:avLst/>
+                    </a:prstGeom>
+                  </pic:spPr>
+                </pic:pic>
+              </a:graphicData>
+            </a:graphic>
+          </wp:inline>
+        </w:drawing>
+      </w:r>
+    </w:p>
+    <w:p>
+      <w:r>
+        <w:t>Took 6</w:t>
+      </w:r>
+      <w:r>
+        <w:t xml:space="preserve">9.35 </w:t>
+      </w:r>
+      <w:r>
+        <w:t xml:space="preserve">seconds, cost </w:t>
+      </w:r>
+      <w:r>
+        <w:t>3831</w:t>
+      </w:r>
+      <w:r>
+        <w:t xml:space="preserve"> tokens</w:t>
+      </w:r>
+      <w:r>
+        <w:t>.</w:t>
+      </w:r>
+    </w:p>
     <w:p/>
     <w:sectPr>
-      <w:headerReference w:type="default" r:id="rId19"/>
-      <w:footerReference w:type="even" r:id="rId20"/>
-      <w:footerReference w:type="default" r:id="rId21"/>
-      <w:footerReference w:type="first" r:id="rId22"/>
+      <w:headerReference w:type="default" r:id="rId24"/>
+      <w:footerReference w:type="even" r:id="rId25"/>
+      <w:footerReference w:type="default" r:id="rId26"/>
+      <w:footerReference w:type="first" r:id="rId27"/>
       <w:pgSz w:w="11906" w:h="16838"/>
       <w:pgMar w:top="1483" w:right="1448" w:bottom="1544" w:left="1435" w:header="720" w:footer="730" w:gutter="0"/>
       <w:pgNumType w:start="0"/>

</xml_diff>